<commit_message>
Add PLOS Computational Biology manuscript and figures
</commit_message>
<xml_diff>
--- a/publication/OmicsTopology_PLOS_Comp_Biol_manuscript.docx
+++ b/publication/OmicsTopology_PLOS_Comp_Biol_manuscript.docx
@@ -14,14 +14,6 @@
           <w:sz w:val="32"/>
         </w:rPr>
         <w:t>OmicsTopology: Calibrated Topology and Phase Diagnostics for Transcriptomic State Spaces</w:t>
-      </w:r>
-    </w:p>
-    <w:p>
-      <w:pPr>
-        <w:jc w:val="center"/>
-      </w:pPr>
-      <w:r>
-        <w:t>Short title: OmicsTopology for transcriptomic geometry</w:t>
       </w:r>
     </w:p>
     <w:p>
@@ -898,7 +890,7 @@
     <w:p>
       <w:pPr/>
       <w:r>
-        <w:t>The public expression datasets analyzed here are available from the Gene Expression Omnibus under accessions GSE3431, GSE158444, GSE11923, GSE50438, GSE116004, GSE138193, GSE137732, and GSE128739. The OmicsTopology source code is publicly available under the MIT License at https://github.com/omixcore/OmicsTopology and is mirrored at https://gitee.com/omixcore/OmicsTopology. The Supporting Information provides numerical summaries of the reported comparisons, including enrichment contingency counts, external ordering scores, source-file checksums, and candidate-cutoff sensitivity results. The repository publication folder also provides the phase-candidate records, external gene-match tables, derived ordering records, and figure coordinates used to generate the current publication figures. Original expression matrices can be retrieved from GEO using the accessions listed above. An archival DOI for the fixed publication snapshot has not yet been assigned.</w:t>
+        <w:t>The public expression datasets analyzed here are available from the Gene Expression Omnibus under accessions GSE3431, GSE158444, GSE11923, GSE50438, GSE116004, GSE138193, GSE137732, and GSE128739. The OmicsTopology source code is publicly available under the MIT License at https://github.com/omixcore/OmicsTopology and is mirrored at https://gitee.com/omixcore/OmicsTopology. The Supporting Information provides the numerical summaries underlying the reported comparisons, including enrichment contingency counts, external ordering scores, source-file checksums, and candidate-cutoff sensitivity results. Original expression matrices can be retrieved from GEO using the accessions listed above. An archival DOI for the fixed publication snapshot has not yet been assigned.</w:t>
       </w:r>
     </w:p>
     <w:p>

</xml_diff>

<commit_message>
Sync corrected PLOS manuscript binaries and remove stale figure staging files
</commit_message>
<xml_diff>
--- a/publication/OmicsTopology_PLOS_Comp_Biol_manuscript.docx
+++ b/publication/OmicsTopology_PLOS_Comp_Biol_manuscript.docx
@@ -13,7 +13,13 @@
           <w:b/>
           <w:sz w:val="32"/>
         </w:rPr>
-        <w:t>OmicsTopology: Calibrated Topology and Phase Diagnostics for Transcriptomic State Spaces</w:t>
+        <w:t>OmicsTopology: calibrated topology and phase diagnostics for transcriptomic state spaces</w:t>
+      </w:r>
+    </w:p>
+    <w:p>
+      <w:pPr/>
+      <w:r>
+        <w:t>Short title: OmicsTopology for transcriptomic state-space analysis</w:t>
       </w:r>
     </w:p>
     <w:p>
@@ -29,7 +35,7 @@
         <w:jc w:val="center"/>
       </w:pPr>
       <w:r>
-        <w:t>1 North Henan Medical University, Xinxiang, China</w:t>
+        <w:t>1 North Henan Medical University, Xinxiang, Henan, China</w:t>
       </w:r>
     </w:p>
     <w:p>
@@ -37,7 +43,7 @@
         <w:jc w:val="center"/>
       </w:pPr>
       <w:r>
-        <w:t>2 Key Laboratory of Tropical Fruit Biology of Ministry of Agriculture, South Subtropical Crops Research Institute, Chinese Academy of Tropical Agricultural Sciences, Zhanjiang, China</w:t>
+        <w:t>2 Key Laboratory of Tropical Fruit Biology of Ministry of Agriculture, South Subtropical Crops Research Institute, Chinese Academy of Tropical Agricultural Sciences, Zhanjiang, Guangdong, China</w:t>
       </w:r>
     </w:p>
     <w:p>
@@ -1000,7 +1006,7 @@
     <w:p>
       <w:pPr/>
       <w:r>
-        <w:t>17. Chazal F, Fasy BT, Lecci F, Rinaldo A, Singh A, Wasserman L. On the bootstrap for persistence diagrams and landscapes. arXiv [Preprint]. 2013. Available from: https://arxiv.org/abs/1311.0376. doi: 10.48550/arXiv.1311.0376.</w:t>
+        <w:t>17. Chazal F, Fasy BT, Lecci F, Rinaldo A, Singh A, Wasserman L. On the bootstrap for persistence diagrams and landscapes. Modeling and Analysis of Information Systems. 2013;20(6):111-120. doi: 10.18255/1818-1015-2013-6-111-120.</w:t>
       </w:r>
     </w:p>
     <w:p>

</xml_diff>